<commit_message>
Add workflow screenshots to evidence
</commit_message>
<xml_diff>
--- a/Flores_1142069_28042026_TPO2.docx
+++ b/Flores_1142069_28042026_TPO2.docx
@@ -55,7 +55,17 @@
     </w:p>
     <w:p>
       <w:r>
-        <w:t xml:space="preserve">Alumno: Laureano Tomás Flores</w:t>
+        <w:t xml:space="preserve">﻿# Portada</w:t>
+      </w:r>
+    </w:p>
+    <w:p>
+      <w:r>
+        <w:t xml:space="preserve"/>
+      </w:r>
+    </w:p>
+    <w:p>
+      <w:r>
+        <w:t xml:space="preserve">Alumno: Laureano TomÃ¡s Flores</w:t>
       </w:r>
     </w:p>
     <w:p>
@@ -1153,12 +1163,52 @@
     </w:p>
     <w:p>
       <w:r>
-        <w:t xml:space="preserve"/>
-      </w:r>
-    </w:p>
-    <w:p>
-      <w:r>
-        <w:t xml:space="preserve">Al realizar el push, el workflow Python tests debe verse en la pestaña Actions del repositorio. La ejecucion correcta debe mostrar:</w:t>
+        <w:t xml:space="preserve">- Captura 1: listado de workflows con ejecuciones exitosas.</w:t>
+      </w:r>
+    </w:p>
+    <w:p>
+      <w:r>
+        <w:t xml:space="preserve">- Captura 2: detalle del workflow con estado Success y artefacto pytest-html-report.</w:t>
+      </w:r>
+    </w:p>
+    <w:p>
+      <w:r>
+        <w:t xml:space="preserve"/>
+      </w:r>
+    </w:p>
+    <w:p>
+      <w:r>
+        <w:t xml:space="preserve">Captura: Captura del listado de workflows exitosos</w:t>
+      </w:r>
+    </w:p>
+    <w:p>
+      <w:r>
+        <w:t xml:space="preserve">Archivo de evidencia: docs/evidencias/pipeline_lista.jpg</w:t>
+      </w:r>
+    </w:p>
+    <w:p>
+      <w:r>
+        <w:t xml:space="preserve"/>
+      </w:r>
+    </w:p>
+    <w:p>
+      <w:r>
+        <w:t xml:space="preserve">Captura: Captura del detalle del workflow exitoso y artefacto generado</w:t>
+      </w:r>
+    </w:p>
+    <w:p>
+      <w:r>
+        <w:t xml:space="preserve">Archivo de evidencia: docs/evidencias/pipeline_detalle.jpg</w:t>
+      </w:r>
+    </w:p>
+    <w:p>
+      <w:r>
+        <w:t xml:space="preserve"/>
+      </w:r>
+    </w:p>
+    <w:p>
+      <w:r>
+        <w:t xml:space="preserve">Al realizar el push, el workflow Python tests debe verse en la pestaÃ±a Actions del repositorio. La ejecucion correcta debe mostrar:</w:t>
       </w:r>
     </w:p>
     <w:p>
@@ -1572,6 +1622,11 @@
     <w:p>
       <w:r>
         <w:t xml:space="preserve">- pytest-html. Documentacion oficial: https://pytest-html.readthedocs.io/</w:t>
+      </w:r>
+    </w:p>
+    <w:p>
+      <w:r>
+        <w:t xml:space="preserve"/>
       </w:r>
     </w:p>
     <w:sectPr>

</xml_diff>